<commit_message>
fix: reverse all document side effects including account money
Deleting an invoice, warranty, or sale now restores stock and reverses
every account transaction owned by that document id. Manual deposits and
other documents stay untouched. Second delete is a no-op.

Co-authored-by: estelami1366-ux <estelami1366-ux@users.noreply.github.com>
</commit_message>
<xml_diff>
--- a/FINAL_TRANSACTION_REVERSAL_FIX_REPORT.docx
+++ b/FINAL_TRANSACTION_REVERSAL_FIX_REPORT.docx
@@ -5,7 +5,6 @@
     <w:p>
       <w:pPr>
         <w:pStyle w:val="Title"/>
-        <w:jc w:val="left"/>
       </w:pPr>
       <w:r>
         <w:t>FINAL TRANSACTION REVERSAL FIX REPORT</w:t>
@@ -13,11 +12,14 @@
     </w:p>
     <w:p>
       <w:r>
-        <w:t>Sirman / لایق الکترونیک پارسیان — نسخه 1405.5.23ο (1405.5.23.16) — 1405/05/23</w:t>
+        <w:t>Sirman / لایق الکترونیک پارسیان — نسخه 1405.5.23π (1405.5.23.17) — 1405/05/23</w:t>
       </w:r>
     </w:p>
     <w:p>
       <w:r>
+        <w:rPr>
+          <w:b/>
+        </w:rPr>
         <w:t>BUG STATUS: FIXED</w:t>
       </w:r>
     </w:p>
@@ -26,22 +28,17 @@
         <w:pStyle w:val="Heading1"/>
       </w:pPr>
       <w:r>
-        <w:t>1. Root Cause</w:t>
+        <w:t>1. Rule</w:t>
       </w:r>
     </w:p>
     <w:p>
       <w:r>
-        <w:t>حذف فاکتور (delInv / delSel) و حذف گارانتی (delWar / delSelWars) فقط رکورد را از آرایه splice می‌کردند و ذخیره می‌کردند. مصرف موجودی و واریز/برداشت حساب به‌عنوان اثر جانبی همان سند ایجاد شده بود، ولی مسیر حذف هیچ Reverseای نداشت.</w:t>
+        <w:t>قانون ساده: با حذف یک سند، تمام تغییراتی که به‌واسطه همان سند اتفاق افتاده باید برگردد. حساب مالی هم همین قانون را دارد.</w:t>
       </w:r>
     </w:p>
     <w:p>
       <w:r>
-        <w:t>فروش قطعات از قبل _restockFromSale داشت؛ فاکتور فروشگاه و پرونده گارانتی این مسیر را نداشتند. Persistence و Restart درست کار می‌کردند، بنابراین دادهٔ ناقص پایدار می‌ماند. این باگ Persistence نیست؛ TRANSACTION SIDE EFFECT REVERSAL است.</w:t>
-      </w:r>
-    </w:p>
-    <w:p>
-      <w:r>
-        <w:t>مالکیت مالی از قبل در تراکنش حساب با refId + refType وجود داشت (invoice / service / sale / manual). مالکیت انبار فاکتور از ردیف‌های items[].code همان فاکتور بسته‌شده است (هر ردیف = ۱ واحد، همان قانون closeInv). مالکیت قطعه گارانتی از فلگ‌های _agencyStockApplied / _companyStockApplied.items است (code + qty واقعی مصرف‌شده).</w:t>
+        <w:t>مالکیت مالی = شماره همان سند روی تراکنش (refId). نوع واریز/برداشت مهم نیست. اگر تراکنش مال سند دیگری باشد یا واریز دستی بدون شماره سند باشد، دست نمی‌خورد.</w:t>
       </w:r>
     </w:p>
     <w:p>
@@ -49,7 +46,25 @@
         <w:pStyle w:val="Heading1"/>
       </w:pPr>
       <w:r>
-        <w:t>2. Files Changed</w:t>
+        <w:t>2. Root Cause</w:t>
+      </w:r>
+    </w:p>
+    <w:p>
+      <w:r>
+        <w:t>حذف فاکتور و گارانتی قبلاً فقط splice بود. نسخه ο موجودی و حساب فاکتور/گارانتی را برگرداند، ولی حذف فروش فقط قطعه را restock می‌کرد و مبلغ واریز همان فروش در حساب می‌ماند.</w:t>
+      </w:r>
+    </w:p>
+    <w:p>
+      <w:r>
+        <w:t>علاوه بر آن، تطبیق مالی با refId+refType سخت‌گیر بود: اگر واریز با شماره سند ثبت شده بود ولی refType فرق داشت (مثلاً service به‌جای invoice)، مبلغ برنمی‌گشت. کاربر گفت قانون باید ساده باشد: این تراکنش مال همین سند است یا نه.</w:t>
+      </w:r>
+    </w:p>
+    <w:p>
+      <w:pPr>
+        <w:pStyle w:val="Heading1"/>
+      </w:pPr>
+      <w:r>
+        <w:t>3. Files Changed</w:t>
       </w:r>
     </w:p>
     <w:p>
@@ -57,7 +72,7 @@
         <w:pStyle w:val="ListBullet"/>
       </w:pPr>
       <w:r>
-        <w:t>desktop/Sirman.Core/Business/TransactionReversal.cs (جدید)</w:t>
+        <w:t>desktop/Sirman.Core/Business/PaymentRules.cs — ReverseOwned (مالکیت با شماره سند)</w:t>
       </w:r>
     </w:p>
     <w:p>
@@ -65,7 +80,7 @@
         <w:pStyle w:val="ListBullet"/>
       </w:pPr>
       <w:r>
-        <w:t>desktop/Sirman.Core/Business/PaymentRules.cs — ReverseLinked / ReverseMatchingWithdraw / refId برداشت</w:t>
+        <w:t>desktop/Sirman.Core/Business/TransactionReversal.cs — DeleteInvoice / DeleteWarranty / DeleteSale</w:t>
       </w:r>
     </w:p>
     <w:p>
@@ -73,7 +88,7 @@
         <w:pStyle w:val="ListBullet"/>
       </w:pPr>
       <w:r>
-        <w:t>desktop/Sirman.Core/Business/InvoiceService.cs — Delete</w:t>
+        <w:t>desktop/Sirman.Core/Application/BusinessFacade.cs — invoice.delete / warranty.delete / sale.delete / payment.reverseOwned</w:t>
       </w:r>
     </w:p>
     <w:p>
@@ -81,7 +96,7 @@
         <w:pStyle w:val="ListBullet"/>
       </w:pPr>
       <w:r>
-        <w:t>desktop/Sirman.Core/Business/WarrantyWorkflow.cs — Delete</w:t>
+        <w:t>desktop/Sirman.Core.Tests/TransactionReversalTests.cs</w:t>
       </w:r>
     </w:p>
     <w:p>
@@ -89,7 +104,7 @@
         <w:pStyle w:val="ListBullet"/>
       </w:pPr>
       <w:r>
-        <w:t>desktop/Sirman.Core/Application/BusinessFacade.cs — invoice.delete / warranty.delete / payment.reverseLinked</w:t>
+        <w:t>Sirman_Final.html — deleteInvoiceAt / deleteWarrantyAt / deleteSaleAt / delInv / delWar / delSale</w:t>
       </w:r>
     </w:p>
     <w:p>
@@ -97,23 +112,7 @@
         <w:pStyle w:val="ListBullet"/>
       </w:pPr>
       <w:r>
-        <w:t>desktop/Sirman.Core.Tests/TransactionReversalTests.cs (جدید)</w:t>
-      </w:r>
-    </w:p>
-    <w:p>
-      <w:pPr>
-        <w:pStyle w:val="ListBullet"/>
-      </w:pPr>
-      <w:r>
-        <w:t>Sirman_Final.html — deleteInvoiceAt / deleteWarrantyAt / delInv / delWar / delSel / delSelWars / withdrawFromAccount</w:t>
-      </w:r>
-    </w:p>
-    <w:p>
-      <w:pPr>
-        <w:pStyle w:val="ListBullet"/>
-      </w:pPr>
-      <w:r>
-        <w:t>test_laegh.js — تست‌های اجرا محور برگشت + نسخه ο</w:t>
+        <w:t>test_laegh.js</w:t>
       </w:r>
     </w:p>
     <w:p>
@@ -129,17 +128,17 @@
         <w:pStyle w:val="Heading1"/>
       </w:pPr>
       <w:r>
-        <w:t>3. Code Changes</w:t>
+        <w:t>4. Code Changes</w:t>
       </w:r>
     </w:p>
     <w:p>
       <w:r>
-        <w:t>منبع حقیقت C# است: UI در exe فقط invoice.delete / warranty.delete را صدا می‌زند و نتیجه را روی اشیاء زنده می‌نویسد، بعد یک‌جا persist می‌کند (inventory + accounts + invoices/warranties). اگر هسته نباشد (HTML مستقیم)، همان فرمول‌ها در reverseInvoiceLocal / reverseWarrantyLocal اجرا می‌شوند — نه یک نویسندهٔ دوم متفاوت در مسیر exe.</w:t>
+        <w:t>منبع حقیقت C# است. در exe، UI فقط invoice.delete / warranty.delete / sale.delete را صدا می‌زند و snapshot را روی اشیاء زنده می‌نویسد، بعد persist می‌کند. اگر Host نباشد، همان فرمول در reverseInvoiceLocal / reverseWarrantyLocal / reverseSaleLocal اجرا می‌شود.</w:t>
       </w:r>
     </w:p>
     <w:p>
       <w:r>
-        <w:t>برداشت نمایندگی حالا refId=شماره پرونده و refType=service می‌گیرد تا تراکنش قدیمی بدون ref هم با مبلغ+موضوع قابل ردیابی بماند.</w:t>
+        <w:t>PaymentRules.ReverseOwned: اگر trx.refId === documentId برمی‌گردد. اگر refId خالی باشد و موضوع حاوی شماره سند (حداقل ۳ کاراکتر) باشد، دادهٔ قدیمی بدون لینک هم برمی‌گردد. واریز دستی بدون شماره سند نمی‌ماند حذف‌شده.</w:t>
       </w:r>
     </w:p>
     <w:p>
@@ -147,17 +146,22 @@
         <w:pStyle w:val="Heading1"/>
       </w:pPr>
       <w:r>
-        <w:t>4. Inventory Reversal</w:t>
+        <w:t>5. Inventory Reversal</w:t>
       </w:r>
     </w:p>
     <w:p>
       <w:r>
-        <w:t>فاکتور بسته‌شده: برای هر ردیف با code، دقیقاً ۱ واحد با InventoryCore.AddStock برمی‌گردد (همان مقداری که invoice.close کم کرده). فاکتور باز موجودی را دست نمی‌زند.</w:t>
+        <w:t>فاکتور بسته‌شده: هر ردیف با code = ۱ واحد (همان closeInv). فاکتور باز موجودی را عوض نمی‌کند.</w:t>
       </w:r>
     </w:p>
     <w:p>
       <w:r>
-        <w:t>گارانتی: فقط اقلام فلگ applied (code + qty همان مصرف). قطعهٔ پروندهٔ دیگر تغییر نمی‌کند. عدد کور Stock += 1 استفاده نشده.</w:t>
+        <w:t>گارانتی: اقلام _agencyStockApplied / _companyStockApplied با qty واقعی.</w:t>
+      </w:r>
+    </w:p>
+    <w:p>
+      <w:r>
+        <w:t>فروش نهایی: اقلام items[].partCode با qty. پیش‌فاکتور انبار را کم نکرده بود؛ حذف آن فقط رکورد را برمی‌دارد.</w:t>
       </w:r>
     </w:p>
     <w:p>
@@ -165,30 +169,22 @@
         <w:pStyle w:val="Heading1"/>
       </w:pPr>
       <w:r>
-        <w:t>5. Financial Reversal</w:t>
+        <w:t>6. Financial Reversal</w:t>
       </w:r>
     </w:p>
     <w:p>
       <w:r>
-        <w:t>PaymentRules.ReverseLinked همه تراکنش‌های همان refId+refType را پیدا می‌کند و مانده را با کم کردن amount همان تراکنش اصلاح می‌کند (نه یک عدد ثابت مثل 100). واریز دستی (refType=manual) و فاکتورهای دیگر باقی می‌مانند.</w:t>
+        <w:t>با حذف سند، همه تراکنش‌های حساب که مال همان شماره سند هستند حذف می‌شوند و مانده با amount همان تراکنش اصلاح می‌شود — نه یک عدد ثابت.</w:t>
       </w:r>
     </w:p>
     <w:p>
       <w:r>
-        <w:t>برداشت نمایندگی قدیمی بدون refId: فقط اگر مبلغ فلگ _agencyPayApplied و موضوع حاوی شماره پرونده روی همان accountId باشد، یک تراکنش برداشت حذف می‌شود.</w:t>
-      </w:r>
-    </w:p>
-    <w:p>
-      <w:pPr>
-        <w:pStyle w:val="Heading1"/>
-      </w:pPr>
-      <w:r>
-        <w:t>6. Warranty Relationship</w:t>
+        <w:t>فاکتور: شماره فاکتور (مثلاً LEP-0007). گارانتی: warranty.id. فروش: sale.id (مثلاً SL-0001).</w:t>
       </w:r>
     </w:p>
     <w:p>
       <w:r>
-        <w:t>حذف فاکتور پرونده گارانتی را خودکار حذف نمی‌کند. هر موجودیت آثار خودش را برمی‌گرداند. کاربر طبق گردش فعلی برنامه فاکتور و پرونده را جدا حذف می‌کند. پس از هر دو حذف، قطعه و مبلغ هر منبع به مالک همان منبع برمی‌گردد.</w:t>
+        <w:t>برداشت نمایندگی قدیمی بدون refId: فقط اگر مبلغ فلگ _agencyPayApplied و موضوع حاوی شماره پرونده روی همان حساب باشد.</w:t>
       </w:r>
     </w:p>
     <w:p>
@@ -200,28 +196,43 @@
       </w:r>
     </w:p>
     <w:p>
+      <w:pPr>
+        <w:pStyle w:val="ListBullet"/>
+      </w:pPr>
       <w:r>
-        <w:t>InvoiceId = invoice.num + refType=invoice</w:t>
+        <w:t>InvoiceId = invoice.num — هر trx با همین refId</w:t>
       </w:r>
     </w:p>
     <w:p>
+      <w:pPr>
+        <w:pStyle w:val="ListBullet"/>
+      </w:pPr>
       <w:r>
-        <w:t>WarrantyId = warranty.id + refType=service</w:t>
+        <w:t>WarrantyId = warranty.id — هر trx با همین refId؛ برداشت قدیمی از روی فلگ</w:t>
       </w:r>
     </w:p>
     <w:p>
+      <w:pPr>
+        <w:pStyle w:val="ListBullet"/>
+      </w:pPr>
       <w:r>
-        <w:t>Inventory invoice: items[].code روی همان فاکتور closed</w:t>
+        <w:t>SaleId = sale.id — هر trx با همین refId</w:t>
       </w:r>
     </w:p>
     <w:p>
+      <w:pPr>
+        <w:pStyle w:val="ListBullet"/>
+      </w:pPr>
       <w:r>
-        <w:t>Inventory warranty: _agencyStockApplied.items / _companyStockApplied.items</w:t>
+        <w:t>Manual deposit: refId خالی و موضوع بدون شماره سند → باقی می‌ماند</w:t>
       </w:r>
     </w:p>
     <w:p>
+      <w:pPr>
+        <w:pStyle w:val="ListBullet"/>
+      </w:pPr>
       <w:r>
-        <w:t>شناسهٔ دیتابیس جدید ساخته نشد.</w:t>
+        <w:t>شناسه دیتابیس جدید ساخته نشد</w:t>
       </w:r>
     </w:p>
     <w:p>
@@ -234,7 +245,7 @@
     </w:p>
     <w:p>
       <w:r>
-        <w:t>اگر فاکتور/پرونده در لیست زنده نباشد (حذف قبلی)، هسته alreadyReversed برمی‌گرداند و موجودی/حساب را دوباره تغییر نمی‌دهد. حذف با فلگ _reversed هم برگشت دوم ندارد.</w:t>
+        <w:t>اگر سند در لیست زنده نباشد، alreadyReversed برمی‌گردد و موجودی/حساب دوباره تغییر نمی‌کند.</w:t>
       </w:r>
     </w:p>
     <w:p>
@@ -250,7 +261,7 @@
         <w:pStyle w:val="ListBullet"/>
       </w:pPr>
       <w:r>
-        <w:t>C# TEST1 Basic invoice: stock 10→9→10, account 0→100→0</w:t>
+        <w:t>C# TEST1–7 برگشت فاکتور/گارانتی (نسخه ο)</w:t>
       </w:r>
     </w:p>
     <w:p>
@@ -258,7 +269,7 @@
         <w:pStyle w:val="ListBullet"/>
       </w:pPr>
       <w:r>
-        <w:t>C# TEST2 Warranty + invoice</w:t>
+        <w:t>C# FinancialReversal_UsesRefIdEvenIfRefTypeDiffers</w:t>
       </w:r>
     </w:p>
     <w:p>
@@ -266,7 +277,7 @@
         <w:pStyle w:val="ListBullet"/>
       </w:pPr>
       <w:r>
-        <w:t>C# TEST3 Multiple parts A-2 B-3</w:t>
+        <w:t>C# SaleDelete_RestoresPartsAndReversesPayment</w:t>
       </w:r>
     </w:p>
     <w:p>
@@ -274,7 +285,7 @@
         <w:pStyle w:val="ListBullet"/>
       </w:pPr>
       <w:r>
-        <w:t>C# TEST4 Two transactions; delete A leaves B</w:t>
+        <w:t>C# SaleDelete_LeavesOtherSaleUntouched</w:t>
       </w:r>
     </w:p>
     <w:p>
@@ -282,7 +293,7 @@
         <w:pStyle w:val="ListBullet"/>
       </w:pPr>
       <w:r>
-        <w:t>C# TEST5 Double delete</w:t>
+        <w:t>C# SaleProforma_DoesNotRestockOrReverseMoney</w:t>
       </w:r>
     </w:p>
     <w:p>
@@ -290,7 +301,7 @@
         <w:pStyle w:val="ListBullet"/>
       </w:pPr>
       <w:r>
-        <w:t>C# TEST6 JSON snapshot after reversal (restart stand-in)</w:t>
+        <w:t>C# DoesNotTouchUnrelatedManualDeposit</w:t>
       </w:r>
     </w:p>
     <w:p>
@@ -298,31 +309,7 @@
         <w:pStyle w:val="ListBullet"/>
       </w:pPr>
       <w:r>
-        <w:t>C# TEST7 Unrelated customers/invoices/inventory/manual deposits unchanged</w:t>
-      </w:r>
-    </w:p>
-    <w:p>
-      <w:pPr>
-        <w:pStyle w:val="ListBullet"/>
-      </w:pPr>
-      <w:r>
-        <w:t>C# Open invoice does not restock; agency pay without refId; ReverseLinked ignores manual</w:t>
-      </w:r>
-    </w:p>
-    <w:p>
-      <w:pPr>
-        <w:pStyle w:val="ListBullet"/>
-      </w:pPr>
-      <w:r>
-        <w:t>HTML execution TEST1/3/4/5 + exe adapter uses Core qty not JS +1</w:t>
-      </w:r>
-    </w:p>
-    <w:p>
-      <w:pPr>
-        <w:pStyle w:val="ListBullet"/>
-      </w:pPr>
-      <w:r>
-        <w:t>شاهد باگ قدیمی splice-only که موجودی را جا می‌گذارد</w:t>
+        <w:t>HTML execution: فاکتور/گارانتی/فروش + تطبیق با شماره سند حتی اگر refType فرق کند</w:t>
       </w:r>
     </w:p>
     <w:p>
@@ -335,12 +322,12 @@
     </w:p>
     <w:p>
       <w:r>
-        <w:t>dotnet test Sirman.Core.Tests: 77 passed, 0 failed (قبلاً 67؛ ۱۰ تست برگشت اضافه شد).</w:t>
+        <w:t>dotnet test Sirman.Core.Tests: 81 passed, 0 failed.</w:t>
       </w:r>
     </w:p>
     <w:p>
       <w:r>
-        <w:t>node test_laegh.js Sirman_Final.html: 510 passed, 0 failed before version refresh; re-run after ο bump in this report cycle.</w:t>
+        <w:t>node test_laegh.js Sirman_Final.html: 512 passed, 0 failed.</w:t>
       </w:r>
     </w:p>
     <w:p>
@@ -353,7 +340,7 @@
     </w:p>
     <w:p>
       <w:r>
-        <w:t>تست‌های قبلی C# و HTML بدون حذف یا تضعیف باقی ماندند. مسیر closeInv / saveWar / پرداخت / فروش قطعات تغییر معماری نگرفتند. Dual-writer در exe برای حذف فاکتور/گارانتی بسته شد: اگر Host هست، JS موجودی را خودش زیاد نمی‌کند.</w:t>
+        <w:t>تست‌های قبلی حذف نشدند. Dual-writer در exe برای حذف فاکتور/گارانتی/فروش بسته است: اگر Host هست، JS موجودی و مانده را خودش حساب نمی‌کند.</w:t>
       </w:r>
     </w:p>
     <w:p>
@@ -366,17 +353,7 @@
     </w:p>
     <w:p>
       <w:r>
-        <w:t>محیط این اجرا Linux است و GUI ویندوز/WebView2 قابل کلیک نیست. Sirman.exe win-x64 با EnableWindowsTargeting منتشر شد و داخل کیت نصب 1405.5.23ο قرار گرفت. هستهٔ همان exe (Sirman.Core.dll) با سناریوهای اجباری TEST1–۷ از طریق BusinessFacade اجرا شد — همان مسیر RunBusiness که UI ویندوز صدا می‌زند.</w:t>
-      </w:r>
-    </w:p>
-    <w:p>
-      <w:r>
-        <w:t>مسیر واقعی UI پس از این نسخه: تأیید حذف → deleteInvoiceAt/deleteWarrantyAt → Host.RunBusiness(invoice.delete|warranty.delete) → اعمال snapshot → persist همزمان invoices/inventory/accounts یا warranties/parts/accounts → auditActivity با reversal=true بدون پسورد.</w:t>
-      </w:r>
-    </w:p>
-    <w:p>
-      <w:r>
-        <w:t>Restart: persist همان JSON localStorage/فایل فعلی است؛ TEST6 round-trip JSON را بعد از برگشت بررسی کرد.</w:t>
+        <w:t>محیط این اجرا Linux است و GUI ویندوز/WebView2 قابل کلیک نیست. Sirman.exe win-x64 داخل کیت نصب 1405.5.23π قرار گرفت. هسته همان exe با BusinessFacade همان مسیر RunBusiness را برای invoice.delete / warranty.delete / sale.delete اجرا کرد.</w:t>
       </w:r>
     </w:p>
     <w:p>
@@ -389,12 +366,12 @@
     </w:p>
     <w:p>
       <w:r>
-        <w:t>قبل: حذف فاکتور/گارانتی = splice رکورد. قطعه مصرف‌شده در انبار می‌ماند کم. مبلغ خدمات در حساب می‌ماند.</w:t>
+        <w:t>قبل: حذف فروش = splice + restock قطعه؛ مبلغ واریز فروش در حساب می‌ماند. حذف فاکتور/گارانتی در ο موجودی و حساب را برمی‌گرداند ولی فروش نه.</w:t>
       </w:r>
     </w:p>
     <w:p>
       <w:r>
-        <w:t>بعد: حذف فاکتور بسته‌شده = برگشت کالاهای همان فاکتور + حذف تراکنش‌های refType=invoice و refId=شماره فاکتور + حذف رکورد. حذف گارانتی = برگشت قطعات applied + حذف تراکنش‌های service همان id + حذف پرونده. حذف دوباره اثر اضافه ندارد. اسناد دیگر دست نخورده می‌مانند.</w:t>
+        <w:t>بعد: حذف هر سند نهایی = برگشت موجودی همان سند + برگشت تراکنش‌های مالی همان شماره سند + حذف رکورد. پیش‌فاکتور فقط حذف می‌شود. حذف دوباره اثر اضافه ندارد. اسناد و واریز دستی دیگر دست‌نخورده می‌مانند.</w:t>
       </w:r>
     </w:p>
     <w:p>
@@ -407,40 +384,25 @@
     </w:p>
     <w:p>
       <w:r>
-        <w:t>حذف فروش قطعات هنوز واریز حساب را برنمی‌گرداند (فقط restock انبار از قبل وجود داشت). این سناریوی گزارش‌شده نبود و در این باگ‌فیکس دست نخورده ماند.</w:t>
+        <w:t>اگر کاربر هنگام ثبت فروش حساب را انتخاب نکند، تراکنش مالی وجود ندارد و برگشت مالی چیزی برای حذف ندارد — درست است.</w:t>
       </w:r>
     </w:p>
     <w:p>
       <w:r>
-        <w:t>اگر کاربر واریز فاکتور را در مودال حساب رد کند، تراکنش مالی وجود ندارد و برگشت مالی چیزی برای حذف ندارد — درست است.</w:t>
+        <w:t>اتمیسیتی با JSON فعلی: جهش‌ها روی clone در Core؛ UI بعد persist پشت‌سرهم. Database transaction در این فاز ساخته نشد.</w:t>
       </w:r>
     </w:p>
     <w:p>
       <w:r>
-        <w:t>اتمیسیتی با JSON فعلی: همه جهش‌ها اول روی clone در Core محاسبه می‌شوند؛ UI بعد همه را در حافظه اعمال و با sv/svAccounts/svParts/svWars پشت سر هم می‌نویسد. Database transaction در این فاز ساخته نشد.</w:t>
+        <w:t>کلیک GUI روی Windows باید توسط کاربر روی Sirman.exe نسخه π تأیید شود؛ این محیط لینوکس آن کلیک را اجرا نمی‌کند.</w:t>
       </w:r>
     </w:p>
     <w:p>
       <w:r>
-        <w:t>کلیک GUI روی Windows باید توسط کاربر روی Sirman.exe نسخه ο تأیید شود؛ این محیط لینوکس آن کلیک را اجرا نمی‌کند.</w:t>
-      </w:r>
-    </w:p>
-    <w:p>
-      <w:pPr>
-        <w:pStyle w:val="Heading1"/>
-      </w:pPr>
-      <w:r>
-        <w:t>BUG STATUS</w:t>
-      </w:r>
-    </w:p>
-    <w:p>
-      <w:r>
-        <w:t>FIXED</w:t>
-      </w:r>
-    </w:p>
-    <w:p>
-      <w:r>
-        <w:t>NO ORPHAN SIDE EFFECTS برای حذف فاکتور و گارانتی: اثر انبار و حساب بدون مالک همان سند باقی نمی‌ماند.</w:t>
+        <w:rPr>
+          <w:b/>
+        </w:rPr>
+        <w:t>BUG STATUS: FIXED. NO ORPHAN SIDE EFFECTS برای حذف فاکتور، گارانتی و فروش: اثر انبار و حساب بدون مالک همان سند باقی نمی‌ماند.</w:t>
       </w:r>
     </w:p>
     <w:sectPr>
@@ -816,10 +778,6 @@
     <w:name w:val="Normal"/>
     <w:qFormat/>
     <w:rsid w:val="00FC693F"/>
-    <w:rPr>
-      <w:rFonts w:ascii="Calibri" w:hAnsi="Calibri"/>
-      <w:sz w:val="22"/>
-    </w:rPr>
   </w:style>
   <w:style w:type="paragraph" w:styleId="Header">
     <w:name w:val="header"/>

</xml_diff>